<commit_message>
Add table of contents and set formulas to pure black
- Insert an auto-updating Word Table of Contents field (sections mapped
  to the Heading 1 style so the TOC populates on open / F9)
- Render all display equations in pure black at 300 dpi to match the
  body text exactly

Co-Authored-By: Claude Opus 4.8 <noreply@anthropic.com>
Claude-Session: https://claude.ai/code/session_01LFdfkiyxV1epwwdex5vGV3
</commit_message>
<xml_diff>
--- a/Math_AI_HL_IA_Social_Media_Ad_Spend_vs_Revenue.docx
+++ b/Math_AI_HL_IA_Social_Media_Ad_Spend_vs_Revenue.docx
@@ -98,23 +98,47 @@
       </w:r>
     </w:p>
     <w:p>
-      <w:pPr>
-        <w:spacing w:before="0" w:after="40"/>
-        <w:jc w:val="both"/>
-      </w:pPr>
+      <w:r>
+        <w:br w:type="page"/>
+      </w:r>
     </w:p>
     <w:p>
       <w:pPr>
-        <w:spacing w:line="240" w:lineRule="auto" w:after="40"/>
-        <w:jc w:val="center"/>
+        <w:spacing w:after="160" w:before="40" w:line="240" w:lineRule="auto"/>
       </w:pPr>
       <w:r>
         <w:rPr>
+          <w:rFonts w:ascii="Times New Roman" w:hAnsi="Times New Roman"/>
+          <w:b/>
+          <w:color w:val="000000"/>
+          <w:sz w:val="30"/>
+        </w:rPr>
+        <w:t>Table of Contents</w:t>
+      </w:r>
+    </w:p>
+    <w:p>
+      <w:pPr>
+        <w:spacing w:line="360" w:lineRule="auto"/>
+      </w:pPr>
+      <w:r>
+        <w:fldChar w:fldCharType="begin" w:dirty="true"/>
+      </w:r>
+      <w:r>
+        <w:instrText xml:space="preserve"> TOC \o "1-1" \h \z \u </w:instrText>
+      </w:r>
+      <w:r>
+        <w:fldChar w:fldCharType="separate"/>
+      </w:r>
+      <w:r>
+        <w:rPr>
           <w:i/>
-          <w:color w:val="666666"/>
-          <w:sz w:val="20"/>
+          <w:color w:val="555555"/>
+          <w:sz w:val="21"/>
         </w:rPr>
-        <w:t>Contents:  1. Introduction and Context   ·   2. Data Collection and Processing   ·   3. Mathematical Investigation   ·   4. Analysis and Comparison   ·   5. Reflection and Practical Limitations   ·   6. Conclusion   ·   Bibliography</w:t>
+        <w:t>Update this field to build the table of contents (in Word: select all with Ctrl+A, then press F9; it also updates automatically on opening).</w:t>
+      </w:r>
+      <w:r>
+        <w:fldChar w:fldCharType="end"/>
       </w:r>
     </w:p>
     <w:p>
@@ -124,6 +148,7 @@
     </w:p>
     <w:p>
       <w:pPr>
+        <w:pStyle w:val="Heading1"/>
         <w:keepNext/>
         <w:spacing w:before="280" w:after="80" w:line="240" w:lineRule="auto"/>
       </w:pPr>
@@ -319,6 +344,7 @@
     </w:p>
     <w:p>
       <w:pPr>
+        <w:pStyle w:val="Heading1"/>
         <w:keepNext/>
         <w:spacing w:before="280" w:after="80" w:line="240" w:lineRule="auto"/>
       </w:pPr>
@@ -2632,7 +2658,7 @@
       <w:r>
         <w:drawing>
           <wp:inline xmlns:a="http://schemas.openxmlformats.org/drawingml/2006/main" xmlns:pic="http://schemas.openxmlformats.org/drawingml/2006/picture">
-            <wp:extent cx="5093208" cy="329184"/>
+            <wp:extent cx="5090160" cy="329184"/>
             <wp:docPr id="2" name="Picture 2"/>
             <wp:cNvGraphicFramePr>
               <a:graphicFrameLocks noChangeAspect="1"/>
@@ -2653,7 +2679,7 @@
                   <pic:spPr>
                     <a:xfrm>
                       <a:off x="0" y="0"/>
-                      <a:ext cx="5093208" cy="329184"/>
+                      <a:ext cx="5090160" cy="329184"/>
                     </a:xfrm>
                     <a:prstGeom prst="rect"/>
                   </pic:spPr>
@@ -2766,6 +2792,7 @@
     </w:p>
     <w:p>
       <w:pPr>
+        <w:pStyle w:val="Heading1"/>
         <w:keepNext/>
         <w:spacing w:before="280" w:after="80" w:line="240" w:lineRule="auto"/>
       </w:pPr>
@@ -2917,7 +2944,7 @@
       <w:r>
         <w:drawing>
           <wp:inline xmlns:a="http://schemas.openxmlformats.org/drawingml/2006/main" xmlns:pic="http://schemas.openxmlformats.org/drawingml/2006/picture">
-            <wp:extent cx="2711196" cy="667512"/>
+            <wp:extent cx="2709672" cy="664464"/>
             <wp:docPr id="5" name="Picture 5"/>
             <wp:cNvGraphicFramePr>
               <a:graphicFrameLocks noChangeAspect="1"/>
@@ -2938,7 +2965,7 @@
                   <pic:spPr>
                     <a:xfrm>
                       <a:off x="0" y="0"/>
-                      <a:ext cx="2711196" cy="667512"/>
+                      <a:ext cx="2709672" cy="664464"/>
                     </a:xfrm>
                     <a:prstGeom prst="rect"/>
                   </pic:spPr>
@@ -2972,7 +2999,7 @@
       <w:r>
         <w:drawing>
           <wp:inline xmlns:a="http://schemas.openxmlformats.org/drawingml/2006/main" xmlns:pic="http://schemas.openxmlformats.org/drawingml/2006/picture">
-            <wp:extent cx="4846320" cy="416052"/>
+            <wp:extent cx="4846320" cy="414528"/>
             <wp:docPr id="6" name="Picture 6"/>
             <wp:cNvGraphicFramePr>
               <a:graphicFrameLocks noChangeAspect="1"/>
@@ -2993,7 +3020,7 @@
                   <pic:spPr>
                     <a:xfrm>
                       <a:off x="0" y="0"/>
-                      <a:ext cx="4846320" cy="416052"/>
+                      <a:ext cx="4846320" cy="414528"/>
                     </a:xfrm>
                     <a:prstGeom prst="rect"/>
                   </pic:spPr>
@@ -3027,7 +3054,7 @@
       <w:r>
         <w:drawing>
           <wp:inline xmlns:a="http://schemas.openxmlformats.org/drawingml/2006/main" xmlns:pic="http://schemas.openxmlformats.org/drawingml/2006/picture">
-            <wp:extent cx="2473452" cy="438912"/>
+            <wp:extent cx="2471928" cy="432816"/>
             <wp:docPr id="7" name="Picture 7"/>
             <wp:cNvGraphicFramePr>
               <a:graphicFrameLocks noChangeAspect="1"/>
@@ -3048,7 +3075,7 @@
                   <pic:spPr>
                     <a:xfrm>
                       <a:off x="0" y="0"/>
-                      <a:ext cx="2473452" cy="438912"/>
+                      <a:ext cx="2471928" cy="432816"/>
                     </a:xfrm>
                     <a:prstGeom prst="rect"/>
                   </pic:spPr>
@@ -3067,7 +3094,7 @@
       <w:r>
         <w:drawing>
           <wp:inline xmlns:a="http://schemas.openxmlformats.org/drawingml/2006/main" xmlns:pic="http://schemas.openxmlformats.org/drawingml/2006/picture">
-            <wp:extent cx="4672584" cy="480060"/>
+            <wp:extent cx="4672584" cy="475488"/>
             <wp:docPr id="8" name="Picture 8"/>
             <wp:cNvGraphicFramePr>
               <a:graphicFrameLocks noChangeAspect="1"/>
@@ -3088,7 +3115,7 @@
                   <pic:spPr>
                     <a:xfrm>
                       <a:off x="0" y="0"/>
-                      <a:ext cx="4672584" cy="480060"/>
+                      <a:ext cx="4672584" cy="475488"/>
                     </a:xfrm>
                     <a:prstGeom prst="rect"/>
                   </pic:spPr>
@@ -3152,7 +3179,7 @@
       <w:r>
         <w:drawing>
           <wp:inline xmlns:a="http://schemas.openxmlformats.org/drawingml/2006/main" xmlns:pic="http://schemas.openxmlformats.org/drawingml/2006/picture">
-            <wp:extent cx="5669280" cy="311072"/>
+            <wp:extent cx="5669280" cy="308479"/>
             <wp:docPr id="9" name="Picture 9"/>
             <wp:cNvGraphicFramePr>
               <a:graphicFrameLocks noChangeAspect="1"/>
@@ -3173,7 +3200,7 @@
                   <pic:spPr>
                     <a:xfrm>
                       <a:off x="0" y="0"/>
-                      <a:ext cx="5669280" cy="311072"/>
+                      <a:ext cx="5669280" cy="308479"/>
                     </a:xfrm>
                     <a:prstGeom prst="rect"/>
                   </pic:spPr>
@@ -3207,7 +3234,7 @@
       <w:r>
         <w:drawing>
           <wp:inline xmlns:a="http://schemas.openxmlformats.org/drawingml/2006/main" xmlns:pic="http://schemas.openxmlformats.org/drawingml/2006/picture">
-            <wp:extent cx="2299716" cy="324612"/>
+            <wp:extent cx="2298192" cy="323088"/>
             <wp:docPr id="10" name="Picture 10"/>
             <wp:cNvGraphicFramePr>
               <a:graphicFrameLocks noChangeAspect="1"/>
@@ -3228,7 +3255,7 @@
                   <pic:spPr>
                     <a:xfrm>
                       <a:off x="0" y="0"/>
-                      <a:ext cx="2299716" cy="324612"/>
+                      <a:ext cx="2298192" cy="323088"/>
                     </a:xfrm>
                     <a:prstGeom prst="rect"/>
                   </pic:spPr>
@@ -3292,7 +3319,7 @@
       <w:r>
         <w:drawing>
           <wp:inline xmlns:a="http://schemas.openxmlformats.org/drawingml/2006/main" xmlns:pic="http://schemas.openxmlformats.org/drawingml/2006/picture">
-            <wp:extent cx="3195828" cy="329184"/>
+            <wp:extent cx="3197352" cy="329184"/>
             <wp:docPr id="11" name="Picture 11"/>
             <wp:cNvGraphicFramePr>
               <a:graphicFrameLocks noChangeAspect="1"/>
@@ -3313,7 +3340,7 @@
                   <pic:spPr>
                     <a:xfrm>
                       <a:off x="0" y="0"/>
-                      <a:ext cx="3195828" cy="329184"/>
+                      <a:ext cx="3197352" cy="329184"/>
                     </a:xfrm>
                     <a:prstGeom prst="rect"/>
                   </pic:spPr>
@@ -3347,7 +3374,7 @@
       <w:r>
         <w:drawing>
           <wp:inline xmlns:a="http://schemas.openxmlformats.org/drawingml/2006/main" xmlns:pic="http://schemas.openxmlformats.org/drawingml/2006/picture">
-            <wp:extent cx="4512564" cy="374904"/>
+            <wp:extent cx="4511040" cy="374904"/>
             <wp:docPr id="12" name="Picture 12"/>
             <wp:cNvGraphicFramePr>
               <a:graphicFrameLocks noChangeAspect="1"/>
@@ -3368,7 +3395,7 @@
                   <pic:spPr>
                     <a:xfrm>
                       <a:off x="0" y="0"/>
-                      <a:ext cx="4512564" cy="374904"/>
+                      <a:ext cx="4511040" cy="374904"/>
                     </a:xfrm>
                     <a:prstGeom prst="rect"/>
                   </pic:spPr>
@@ -3387,7 +3414,7 @@
       <w:r>
         <w:drawing>
           <wp:inline xmlns:a="http://schemas.openxmlformats.org/drawingml/2006/main" xmlns:pic="http://schemas.openxmlformats.org/drawingml/2006/picture">
-            <wp:extent cx="5669280" cy="305812"/>
+            <wp:extent cx="5669280" cy="305953"/>
             <wp:docPr id="13" name="Picture 13"/>
             <wp:cNvGraphicFramePr>
               <a:graphicFrameLocks noChangeAspect="1"/>
@@ -3408,7 +3435,7 @@
                   <pic:spPr>
                     <a:xfrm>
                       <a:off x="0" y="0"/>
-                      <a:ext cx="5669280" cy="305812"/>
+                      <a:ext cx="5669280" cy="305953"/>
                     </a:xfrm>
                     <a:prstGeom prst="rect"/>
                   </pic:spPr>
@@ -3442,7 +3469,7 @@
       <w:r>
         <w:drawing>
           <wp:inline xmlns:a="http://schemas.openxmlformats.org/drawingml/2006/main" xmlns:pic="http://schemas.openxmlformats.org/drawingml/2006/picture">
-            <wp:extent cx="2116836" cy="329184"/>
+            <wp:extent cx="2115312" cy="329184"/>
             <wp:docPr id="14" name="Picture 14"/>
             <wp:cNvGraphicFramePr>
               <a:graphicFrameLocks noChangeAspect="1"/>
@@ -3463,7 +3490,7 @@
                   <pic:spPr>
                     <a:xfrm>
                       <a:off x="0" y="0"/>
-                      <a:ext cx="2116836" cy="329184"/>
+                      <a:ext cx="2115312" cy="329184"/>
                     </a:xfrm>
                     <a:prstGeom prst="rect"/>
                   </pic:spPr>
@@ -3616,6 +3643,7 @@
     </w:p>
     <w:p>
       <w:pPr>
+        <w:pStyle w:val="Heading1"/>
         <w:keepNext/>
         <w:spacing w:before="280" w:after="80" w:line="240" w:lineRule="auto"/>
       </w:pPr>
@@ -3667,7 +3695,7 @@
       <w:r>
         <w:drawing>
           <wp:inline xmlns:a="http://schemas.openxmlformats.org/drawingml/2006/main" xmlns:pic="http://schemas.openxmlformats.org/drawingml/2006/picture">
-            <wp:extent cx="1092708" cy="512064"/>
+            <wp:extent cx="1091184" cy="509016"/>
             <wp:docPr id="17" name="Picture 17"/>
             <wp:cNvGraphicFramePr>
               <a:graphicFrameLocks noChangeAspect="1"/>
@@ -3688,7 +3716,7 @@
                   <pic:spPr>
                     <a:xfrm>
                       <a:off x="0" y="0"/>
-                      <a:ext cx="1092708" cy="512064"/>
+                      <a:ext cx="1091184" cy="509016"/>
                     </a:xfrm>
                     <a:prstGeom prst="rect"/>
                   </pic:spPr>
@@ -3722,7 +3750,7 @@
       <w:r>
         <w:drawing>
           <wp:inline xmlns:a="http://schemas.openxmlformats.org/drawingml/2006/main" xmlns:pic="http://schemas.openxmlformats.org/drawingml/2006/picture">
-            <wp:extent cx="3099816" cy="452628"/>
+            <wp:extent cx="3099816" cy="451104"/>
             <wp:docPr id="18" name="Picture 18"/>
             <wp:cNvGraphicFramePr>
               <a:graphicFrameLocks noChangeAspect="1"/>
@@ -3743,7 +3771,7 @@
                   <pic:spPr>
                     <a:xfrm>
                       <a:off x="0" y="0"/>
-                      <a:ext cx="3099816" cy="452628"/>
+                      <a:ext cx="3099816" cy="451104"/>
                     </a:xfrm>
                     <a:prstGeom prst="rect"/>
                   </pic:spPr>
@@ -3762,7 +3790,7 @@
       <w:r>
         <w:drawing>
           <wp:inline xmlns:a="http://schemas.openxmlformats.org/drawingml/2006/main" xmlns:pic="http://schemas.openxmlformats.org/drawingml/2006/picture">
-            <wp:extent cx="2674620" cy="420624"/>
+            <wp:extent cx="2676144" cy="417576"/>
             <wp:docPr id="19" name="Picture 19"/>
             <wp:cNvGraphicFramePr>
               <a:graphicFrameLocks noChangeAspect="1"/>
@@ -3783,7 +3811,7 @@
                   <pic:spPr>
                     <a:xfrm>
                       <a:off x="0" y="0"/>
-                      <a:ext cx="2674620" cy="420624"/>
+                      <a:ext cx="2676144" cy="417576"/>
                     </a:xfrm>
                     <a:prstGeom prst="rect"/>
                   </pic:spPr>
@@ -3902,7 +3930,7 @@
       <w:r>
         <w:drawing>
           <wp:inline xmlns:a="http://schemas.openxmlformats.org/drawingml/2006/main" xmlns:pic="http://schemas.openxmlformats.org/drawingml/2006/picture">
-            <wp:extent cx="4114800" cy="507492"/>
+            <wp:extent cx="4111752" cy="509016"/>
             <wp:docPr id="21" name="Picture 21"/>
             <wp:cNvGraphicFramePr>
               <a:graphicFrameLocks noChangeAspect="1"/>
@@ -3923,7 +3951,7 @@
                   <pic:spPr>
                     <a:xfrm>
                       <a:off x="0" y="0"/>
-                      <a:ext cx="4114800" cy="507492"/>
+                      <a:ext cx="4111752" cy="509016"/>
                     </a:xfrm>
                     <a:prstGeom prst="rect"/>
                   </pic:spPr>
@@ -3987,7 +4015,7 @@
       <w:r>
         <w:drawing>
           <wp:inline xmlns:a="http://schemas.openxmlformats.org/drawingml/2006/main" xmlns:pic="http://schemas.openxmlformats.org/drawingml/2006/picture">
-            <wp:extent cx="5669280" cy="418804"/>
+            <wp:extent cx="5669280" cy="417551"/>
             <wp:docPr id="22" name="Picture 22"/>
             <wp:cNvGraphicFramePr>
               <a:graphicFrameLocks noChangeAspect="1"/>
@@ -4008,7 +4036,7 @@
                   <pic:spPr>
                     <a:xfrm>
                       <a:off x="0" y="0"/>
-                      <a:ext cx="5669280" cy="418804"/>
+                      <a:ext cx="5669280" cy="417551"/>
                     </a:xfrm>
                     <a:prstGeom prst="rect"/>
                   </pic:spPr>
@@ -4662,7 +4690,7 @@
       <w:r>
         <w:drawing>
           <wp:inline xmlns:a="http://schemas.openxmlformats.org/drawingml/2006/main" xmlns:pic="http://schemas.openxmlformats.org/drawingml/2006/picture">
-            <wp:extent cx="3744468" cy="365760"/>
+            <wp:extent cx="3745992" cy="365760"/>
             <wp:docPr id="25" name="Picture 25"/>
             <wp:cNvGraphicFramePr>
               <a:graphicFrameLocks noChangeAspect="1"/>
@@ -4683,7 +4711,7 @@
                   <pic:spPr>
                     <a:xfrm>
                       <a:off x="0" y="0"/>
-                      <a:ext cx="3744468" cy="365760"/>
+                      <a:ext cx="3745992" cy="365760"/>
                     </a:xfrm>
                     <a:prstGeom prst="rect"/>
                   </pic:spPr>
@@ -4717,7 +4745,7 @@
       <w:r>
         <w:drawing>
           <wp:inline xmlns:a="http://schemas.openxmlformats.org/drawingml/2006/main" xmlns:pic="http://schemas.openxmlformats.org/drawingml/2006/picture">
-            <wp:extent cx="5669280" cy="370851"/>
+            <wp:extent cx="5669280" cy="370937"/>
             <wp:docPr id="26" name="Picture 26"/>
             <wp:cNvGraphicFramePr>
               <a:graphicFrameLocks noChangeAspect="1"/>
@@ -4738,7 +4766,7 @@
                   <pic:spPr>
                     <a:xfrm>
                       <a:off x="0" y="0"/>
-                      <a:ext cx="5669280" cy="370851"/>
+                      <a:ext cx="5669280" cy="370937"/>
                     </a:xfrm>
                     <a:prstGeom prst="rect"/>
                   </pic:spPr>
@@ -4766,6 +4794,7 @@
     </w:p>
     <w:p>
       <w:pPr>
+        <w:pStyle w:val="Heading1"/>
         <w:keepNext/>
         <w:spacing w:before="280" w:after="80" w:line="240" w:lineRule="auto"/>
       </w:pPr>
@@ -4817,7 +4846,7 @@
       <w:r>
         <w:drawing>
           <wp:inline xmlns:a="http://schemas.openxmlformats.org/drawingml/2006/main" xmlns:pic="http://schemas.openxmlformats.org/drawingml/2006/picture">
-            <wp:extent cx="4722876" cy="356616"/>
+            <wp:extent cx="4721352" cy="356616"/>
             <wp:docPr id="27" name="Picture 27"/>
             <wp:cNvGraphicFramePr>
               <a:graphicFrameLocks noChangeAspect="1"/>
@@ -4838,7 +4867,7 @@
                   <pic:spPr>
                     <a:xfrm>
                       <a:off x="0" y="0"/>
-                      <a:ext cx="4722876" cy="356616"/>
+                      <a:ext cx="4721352" cy="356616"/>
                     </a:xfrm>
                     <a:prstGeom prst="rect"/>
                   </pic:spPr>
@@ -4926,6 +4955,7 @@
     </w:p>
     <w:p>
       <w:pPr>
+        <w:pStyle w:val="Heading1"/>
         <w:keepNext/>
         <w:spacing w:before="280" w:after="80" w:line="240" w:lineRule="auto"/>
       </w:pPr>
@@ -4971,6 +5001,7 @@
     </w:p>
     <w:p>
       <w:pPr>
+        <w:pStyle w:val="Heading1"/>
         <w:keepNext/>
         <w:spacing w:before="280" w:after="80" w:line="240" w:lineRule="auto"/>
       </w:pPr>
@@ -5559,15 +5590,15 @@
     <w:pPr>
       <w:keepNext/>
       <w:keepLines/>
-      <w:spacing w:before="480" w:after="0"/>
+      <w:spacing w:before="280" w:after="80" w:line="240" w:lineRule="auto"/>
       <w:outlineLvl w:val="0"/>
     </w:pPr>
     <w:rPr>
-      <w:rFonts w:asciiTheme="majorHAnsi" w:eastAsiaTheme="majorEastAsia" w:hAnsiTheme="majorHAnsi" w:cstheme="majorBidi"/>
+      <w:rFonts w:asciiTheme="majorHAnsi" w:eastAsiaTheme="majorEastAsia" w:hAnsiTheme="majorHAnsi" w:cstheme="majorBidi" w:ascii="Times New Roman" w:hAnsi="Times New Roman"/>
       <w:b/>
       <w:bCs/>
-      <w:color w:val="365F91" w:themeColor="accent1" w:themeShade="BF"/>
-      <w:sz w:val="28"/>
+      <w:color w:val="000000"/>
+      <w:sz w:val="30"/>
       <w:szCs w:val="28"/>
     </w:rPr>
   </w:style>

</xml_diff>